<commit_message>
Template: drop the calligraphy font (default font)
Co-Authored-By: Claude Sonnet 5.5 <noreply@anthropic.com>
Claude-Session: https://claude.ai/code/session_01Lr4nGZF4GGC967dspef5Pw
</commit_message>
<xml_diff>
--- a/deliverables/jabara-word-template.docx
+++ b/deliverables/jabara-word-template.docx
@@ -5,7 +5,6 @@
     <w:p>
       <w:r>
         <w:rPr>
-          <w:rFonts w:ascii="HGS行書体" w:eastAsia="HGS行書体" w:hAnsi="HGS行書体"/>
           <w:b/>
           <w:bCs/>
           <w:sz w:val="48"/>
@@ -17,7 +16,6 @@
     <w:p>
       <w:r>
         <w:rPr>
-          <w:rFonts w:ascii="HGS行書体" w:eastAsia="HGS行書体" w:hAnsi="HGS行書体"/>
           <w:sz w:val="36"/>
           <w:szCs w:val="36"/>
         </w:rPr>
@@ -27,7 +25,6 @@
     <w:p>
       <w:r>
         <w:rPr>
-          <w:rFonts w:ascii="HGS行書体" w:eastAsia="HGS行書体" w:hAnsi="HGS行書体"/>
           <w:sz w:val="36"/>
           <w:szCs w:val="36"/>
         </w:rPr>
@@ -42,7 +39,6 @@
       </w:pPr>
       <w:r>
         <w:rPr>
-          <w:rFonts w:ascii="HGS行書体" w:eastAsia="HGS行書体" w:hAnsi="HGS行書体"/>
           <w:sz w:val="21"/>
           <w:szCs w:val="21"/>
         </w:rPr>
@@ -55,7 +51,6 @@
       </w:pPr>
       <w:r>
         <w:rPr>
-          <w:rFonts w:ascii="HGS行書体" w:eastAsia="HGS行書体" w:hAnsi="HGS行書体"/>
           <w:sz w:val="21"/>
           <w:szCs w:val="21"/>
         </w:rPr>
@@ -68,7 +63,6 @@
       </w:pPr>
       <w:r>
         <w:rPr>
-          <w:rFonts w:ascii="HGS行書体" w:eastAsia="HGS行書体" w:hAnsi="HGS行書体"/>
           <w:sz w:val="21"/>
           <w:szCs w:val="21"/>
         </w:rPr>
@@ -81,7 +75,6 @@
       </w:pPr>
       <w:r>
         <w:rPr>
-          <w:rFonts w:ascii="HGS行書体" w:eastAsia="HGS行書体" w:hAnsi="HGS行書体"/>
           <w:sz w:val="21"/>
           <w:szCs w:val="21"/>
         </w:rPr>
@@ -94,7 +87,6 @@
       </w:pPr>
       <w:r>
         <w:rPr>
-          <w:rFonts w:ascii="HGS行書体" w:eastAsia="HGS行書体" w:hAnsi="HGS行書体"/>
           <w:sz w:val="21"/>
           <w:szCs w:val="21"/>
         </w:rPr>
@@ -108,7 +100,6 @@
       </w:pPr>
       <w:r>
         <w:rPr>
-          <w:rFonts w:ascii="HGS行書体" w:eastAsia="HGS行書体" w:hAnsi="HGS行書体"/>
           <w:sz w:val="21"/>
           <w:szCs w:val="21"/>
         </w:rPr>
@@ -121,7 +112,6 @@
       </w:pPr>
       <w:r>
         <w:rPr>
-          <w:rFonts w:ascii="HGS行書体" w:eastAsia="HGS行書体" w:hAnsi="HGS行書体"/>
           <w:sz w:val="21"/>
           <w:szCs w:val="21"/>
         </w:rPr>
@@ -134,7 +124,6 @@
       </w:pPr>
       <w:r>
         <w:rPr>
-          <w:rFonts w:ascii="HGS行書体" w:eastAsia="HGS行書体" w:hAnsi="HGS行書体"/>
           <w:sz w:val="21"/>
           <w:szCs w:val="21"/>
         </w:rPr>
@@ -147,7 +136,6 @@
       </w:pPr>
       <w:r>
         <w:rPr>
-          <w:rFonts w:ascii="HGS行書体" w:eastAsia="HGS行書体" w:hAnsi="HGS行書体"/>
           <w:sz w:val="21"/>
           <w:szCs w:val="21"/>
         </w:rPr>

</xml_diff>